<commit_message>
Print Total THC once, not as a redundant MK|EN pair
A percentage is the same figure in either language — only the decimal
mark would differ — so bilingual-splitting it duplicated nothing but
the separator. Now printed once per row, decimal comma (document is
Macedonian-primary).
</commit_message>
<xml_diff>
--- a/deliverables/batch_thc_summary/P-Batch_Total_THC_Summary.docx
+++ b/deliverables/batch_thc_summary/P-Batch_Total_THC_Summary.docx
@@ -427,26 +427,6 @@
               </w:rPr>
               <w:t>20,39%</w:t>
             </w:r>
-            <w:r>
-              <w:rPr>
-                <w:rFonts w:ascii="Calibri" w:hAnsi="Calibri"/>
-                <w:b w:val="0"/>
-                <w:i w:val="0"/>
-                <w:color w:val="000000"/>
-                <w:sz w:val="16"/>
-              </w:rPr>
-              <w:t xml:space="preserve"> | </w:t>
-            </w:r>
-            <w:r>
-              <w:rPr>
-                <w:rFonts w:ascii="Calibri" w:hAnsi="Calibri"/>
-                <w:b w:val="0"/>
-                <w:i/>
-                <w:color w:val="000000"/>
-                <w:sz w:val="16"/>
-              </w:rPr>
-              <w:t>20.39%</w:t>
-            </w:r>
           </w:p>
         </w:tc>
         <w:tc>
@@ -564,26 +544,6 @@
               </w:rPr>
               <w:t>21,51%</w:t>
             </w:r>
-            <w:r>
-              <w:rPr>
-                <w:rFonts w:ascii="Calibri" w:hAnsi="Calibri"/>
-                <w:b w:val="0"/>
-                <w:i w:val="0"/>
-                <w:color w:val="000000"/>
-                <w:sz w:val="16"/>
-              </w:rPr>
-              <w:t xml:space="preserve"> | </w:t>
-            </w:r>
-            <w:r>
-              <w:rPr>
-                <w:rFonts w:ascii="Calibri" w:hAnsi="Calibri"/>
-                <w:b w:val="0"/>
-                <w:i/>
-                <w:color w:val="000000"/>
-                <w:sz w:val="16"/>
-              </w:rPr>
-              <w:t>21.51%</w:t>
-            </w:r>
           </w:p>
         </w:tc>
         <w:tc>
@@ -701,26 +661,6 @@
               </w:rPr>
               <w:t>24,96%</w:t>
             </w:r>
-            <w:r>
-              <w:rPr>
-                <w:rFonts w:ascii="Calibri" w:hAnsi="Calibri"/>
-                <w:b w:val="0"/>
-                <w:i w:val="0"/>
-                <w:color w:val="000000"/>
-                <w:sz w:val="16"/>
-              </w:rPr>
-              <w:t xml:space="preserve"> | </w:t>
-            </w:r>
-            <w:r>
-              <w:rPr>
-                <w:rFonts w:ascii="Calibri" w:hAnsi="Calibri"/>
-                <w:b w:val="0"/>
-                <w:i/>
-                <w:color w:val="000000"/>
-                <w:sz w:val="16"/>
-              </w:rPr>
-              <w:t>24.96%</w:t>
-            </w:r>
           </w:p>
         </w:tc>
         <w:tc>
@@ -838,26 +778,6 @@
               </w:rPr>
               <w:t>22,30%</w:t>
             </w:r>
-            <w:r>
-              <w:rPr>
-                <w:rFonts w:ascii="Calibri" w:hAnsi="Calibri"/>
-                <w:b w:val="0"/>
-                <w:i w:val="0"/>
-                <w:color w:val="000000"/>
-                <w:sz w:val="16"/>
-              </w:rPr>
-              <w:t xml:space="preserve"> | </w:t>
-            </w:r>
-            <w:r>
-              <w:rPr>
-                <w:rFonts w:ascii="Calibri" w:hAnsi="Calibri"/>
-                <w:b w:val="0"/>
-                <w:i/>
-                <w:color w:val="000000"/>
-                <w:sz w:val="16"/>
-              </w:rPr>
-              <w:t>22.30%</w:t>
-            </w:r>
           </w:p>
         </w:tc>
         <w:tc>
@@ -1092,26 +1012,6 @@
               </w:rPr>
               <w:t>8,02%</w:t>
             </w:r>
-            <w:r>
-              <w:rPr>
-                <w:rFonts w:ascii="Calibri" w:hAnsi="Calibri"/>
-                <w:b w:val="0"/>
-                <w:i w:val="0"/>
-                <w:color w:val="000000"/>
-                <w:sz w:val="16"/>
-              </w:rPr>
-              <w:t xml:space="preserve"> | </w:t>
-            </w:r>
-            <w:r>
-              <w:rPr>
-                <w:rFonts w:ascii="Calibri" w:hAnsi="Calibri"/>
-                <w:b w:val="0"/>
-                <w:i/>
-                <w:color w:val="000000"/>
-                <w:sz w:val="16"/>
-              </w:rPr>
-              <w:t>8.02%</w:t>
-            </w:r>
           </w:p>
         </w:tc>
         <w:tc>
@@ -1229,26 +1129,6 @@
               </w:rPr>
               <w:t>12,39%</w:t>
             </w:r>
-            <w:r>
-              <w:rPr>
-                <w:rFonts w:ascii="Calibri" w:hAnsi="Calibri"/>
-                <w:b w:val="0"/>
-                <w:i w:val="0"/>
-                <w:color w:val="000000"/>
-                <w:sz w:val="16"/>
-              </w:rPr>
-              <w:t xml:space="preserve"> | </w:t>
-            </w:r>
-            <w:r>
-              <w:rPr>
-                <w:rFonts w:ascii="Calibri" w:hAnsi="Calibri"/>
-                <w:b w:val="0"/>
-                <w:i/>
-                <w:color w:val="000000"/>
-                <w:sz w:val="16"/>
-              </w:rPr>
-              <w:t>12.39%</w:t>
-            </w:r>
           </w:p>
         </w:tc>
         <w:tc>
@@ -1366,26 +1246,6 @@
               </w:rPr>
               <w:t>13,34%</w:t>
             </w:r>
-            <w:r>
-              <w:rPr>
-                <w:rFonts w:ascii="Calibri" w:hAnsi="Calibri"/>
-                <w:b w:val="0"/>
-                <w:i w:val="0"/>
-                <w:color w:val="000000"/>
-                <w:sz w:val="16"/>
-              </w:rPr>
-              <w:t xml:space="preserve"> | </w:t>
-            </w:r>
-            <w:r>
-              <w:rPr>
-                <w:rFonts w:ascii="Calibri" w:hAnsi="Calibri"/>
-                <w:b w:val="0"/>
-                <w:i/>
-                <w:color w:val="000000"/>
-                <w:sz w:val="16"/>
-              </w:rPr>
-              <w:t>13.34%</w:t>
-            </w:r>
           </w:p>
         </w:tc>
         <w:tc>
@@ -1523,26 +1383,6 @@
               </w:rPr>
               <w:t>19,81%</w:t>
             </w:r>
-            <w:r>
-              <w:rPr>
-                <w:rFonts w:ascii="Calibri" w:hAnsi="Calibri"/>
-                <w:b w:val="0"/>
-                <w:i w:val="0"/>
-                <w:color w:val="000000"/>
-                <w:sz w:val="16"/>
-              </w:rPr>
-              <w:t xml:space="preserve"> | </w:t>
-            </w:r>
-            <w:r>
-              <w:rPr>
-                <w:rFonts w:ascii="Calibri" w:hAnsi="Calibri"/>
-                <w:b w:val="0"/>
-                <w:i/>
-                <w:color w:val="000000"/>
-                <w:sz w:val="16"/>
-              </w:rPr>
-              <w:t>19.81%</w:t>
-            </w:r>
           </w:p>
         </w:tc>
         <w:tc>
@@ -1660,26 +1500,6 @@
               </w:rPr>
               <w:t>25,98%</w:t>
             </w:r>
-            <w:r>
-              <w:rPr>
-                <w:rFonts w:ascii="Calibri" w:hAnsi="Calibri"/>
-                <w:b w:val="0"/>
-                <w:i w:val="0"/>
-                <w:color w:val="000000"/>
-                <w:sz w:val="16"/>
-              </w:rPr>
-              <w:t xml:space="preserve"> | </w:t>
-            </w:r>
-            <w:r>
-              <w:rPr>
-                <w:rFonts w:ascii="Calibri" w:hAnsi="Calibri"/>
-                <w:b w:val="0"/>
-                <w:i/>
-                <w:color w:val="000000"/>
-                <w:sz w:val="16"/>
-              </w:rPr>
-              <w:t>25.98%</w:t>
-            </w:r>
           </w:p>
         </w:tc>
         <w:tc>
@@ -1796,26 +1616,6 @@
                 <w:sz w:val="20"/>
               </w:rPr>
               <w:t>21,29%</w:t>
-            </w:r>
-            <w:r>
-              <w:rPr>
-                <w:rFonts w:ascii="Calibri" w:hAnsi="Calibri"/>
-                <w:b w:val="0"/>
-                <w:i w:val="0"/>
-                <w:color w:val="000000"/>
-                <w:sz w:val="16"/>
-              </w:rPr>
-              <w:t xml:space="preserve"> | </w:t>
-            </w:r>
-            <w:r>
-              <w:rPr>
-                <w:rFonts w:ascii="Calibri" w:hAnsi="Calibri"/>
-                <w:b w:val="0"/>
-                <w:i/>
-                <w:color w:val="000000"/>
-                <w:sz w:val="16"/>
-              </w:rPr>
-              <w:t>21.29%</w:t>
             </w:r>
           </w:p>
         </w:tc>

</xml_diff>

<commit_message>
Print Total THC exactly as the source certificates print it
No comma-conversion at all: every certificate read for this table
prints its result with a period (20.39%, 21.51%, ...). Matching that
verbatim is the correct formatting, not introducing a Macedonian
comma the source never used.
</commit_message>
<xml_diff>
--- a/deliverables/batch_thc_summary/P-Batch_Total_THC_Summary.docx
+++ b/deliverables/batch_thc_summary/P-Batch_Total_THC_Summary.docx
@@ -425,7 +425,7 @@
                 <w:color w:val="000000"/>
                 <w:sz w:val="20"/>
               </w:rPr>
-              <w:t>20,39%</w:t>
+              <w:t>20.39%</w:t>
             </w:r>
           </w:p>
         </w:tc>
@@ -542,7 +542,7 @@
                 <w:color w:val="000000"/>
                 <w:sz w:val="20"/>
               </w:rPr>
-              <w:t>21,51%</w:t>
+              <w:t>21.51%</w:t>
             </w:r>
           </w:p>
         </w:tc>
@@ -659,7 +659,7 @@
                 <w:color w:val="000000"/>
                 <w:sz w:val="20"/>
               </w:rPr>
-              <w:t>24,96%</w:t>
+              <w:t>24.96%</w:t>
             </w:r>
           </w:p>
         </w:tc>
@@ -776,7 +776,7 @@
                 <w:color w:val="000000"/>
                 <w:sz w:val="20"/>
               </w:rPr>
-              <w:t>22,30%</w:t>
+              <w:t>22.30%</w:t>
             </w:r>
           </w:p>
         </w:tc>
@@ -1010,7 +1010,7 @@
                 <w:color w:val="000000"/>
                 <w:sz w:val="20"/>
               </w:rPr>
-              <w:t>8,02%</w:t>
+              <w:t>8.02%</w:t>
             </w:r>
           </w:p>
         </w:tc>
@@ -1127,7 +1127,7 @@
                 <w:color w:val="000000"/>
                 <w:sz w:val="20"/>
               </w:rPr>
-              <w:t>12,39%</w:t>
+              <w:t>12.39%</w:t>
             </w:r>
           </w:p>
         </w:tc>
@@ -1244,7 +1244,7 @@
                 <w:color w:val="000000"/>
                 <w:sz w:val="20"/>
               </w:rPr>
-              <w:t>13,34%</w:t>
+              <w:t>13.34%</w:t>
             </w:r>
           </w:p>
         </w:tc>
@@ -1381,7 +1381,7 @@
                 <w:color w:val="000000"/>
                 <w:sz w:val="20"/>
               </w:rPr>
-              <w:t>19,81%</w:t>
+              <w:t>19.81%</w:t>
             </w:r>
           </w:p>
         </w:tc>
@@ -1498,7 +1498,7 @@
                 <w:color w:val="000000"/>
                 <w:sz w:val="20"/>
               </w:rPr>
-              <w:t>25,98%</w:t>
+              <w:t>25.98%</w:t>
             </w:r>
           </w:p>
         </w:tc>
@@ -1615,7 +1615,7 @@
                 <w:color w:val="000000"/>
                 <w:sz w:val="20"/>
               </w:rPr>
-              <w:t>21,29%</w:t>
+              <w:t>21.29%</w:t>
             </w:r>
           </w:p>
         </w:tc>

</xml_diff>

<commit_message>
Cite the latest-dated document per batch, regardless of institution
Five batches (P060022, P060072, P050282, P050302, P050312) have a
PurelyPlant house Certificate of Analysis dated later than the
outsourced CNP lab cert I had cited. Read all five directly: each
restates the identical Total THC figure already on file (it's PP's
consolidated release certificate, not a retest), but carries its own
certificate number and a later approval date — so that's the correct
eCoA code/date to cite as the last-tested record. The three rows still
citing the outsourced lab (P050222, P060322, P050072) do so because no
later PP document exists, or a later outsourced retest supersedes the
PP one anyway.
</commit_message>
<xml_diff>
--- a/deliverables/batch_thc_summary/P-Batch_Total_THC_Summary.docx
+++ b/deliverables/batch_thc_summary/P-Batch_Total_THC_Summary.docx
@@ -682,7 +682,7 @@
                 <w:color w:val="000000"/>
                 <w:sz w:val="18"/>
               </w:rPr>
-              <w:t>ППК26002</w:t>
+              <w:t>PP · QCCoA 001v02 (Cert. No. 041)</w:t>
             </w:r>
           </w:p>
         </w:tc>
@@ -705,7 +705,7 @@
                 <w:color w:val="000000"/>
                 <w:sz w:val="18"/>
               </w:rPr>
-              <w:t>21.01.2026</w:t>
+              <w:t>20.02.2026</w:t>
             </w:r>
           </w:p>
         </w:tc>
@@ -799,7 +799,7 @@
                 <w:color w:val="000000"/>
                 <w:sz w:val="18"/>
               </w:rPr>
-              <w:t>ППК26007</w:t>
+              <w:t>PP · QCCoA 001v02 (Cert. No. 039)</w:t>
             </w:r>
           </w:p>
         </w:tc>
@@ -822,7 +822,7 @@
                 <w:color w:val="000000"/>
                 <w:sz w:val="18"/>
               </w:rPr>
-              <w:t>21.01.2026</w:t>
+              <w:t>20.02.2026</w:t>
             </w:r>
           </w:p>
         </w:tc>
@@ -1033,7 +1033,7 @@
                 <w:color w:val="000000"/>
                 <w:sz w:val="18"/>
               </w:rPr>
-              <w:t>ППК25370</w:t>
+              <w:t>PP · QCCoA 001v02 (Cert. No. 027)</w:t>
             </w:r>
           </w:p>
         </w:tc>
@@ -1056,7 +1056,7 @@
                 <w:color w:val="000000"/>
                 <w:sz w:val="18"/>
               </w:rPr>
-              <w:t>28.11.2025</w:t>
+              <w:t>21.01.2026</w:t>
             </w:r>
           </w:p>
         </w:tc>
@@ -1404,7 +1404,7 @@
                 <w:color w:val="000000"/>
                 <w:sz w:val="18"/>
               </w:rPr>
-              <w:t>ППК25379</w:t>
+              <w:t>PP · QCCoA 001v02 (Cert. No. 019)</w:t>
             </w:r>
           </w:p>
         </w:tc>
@@ -1427,7 +1427,7 @@
                 <w:color w:val="000000"/>
                 <w:sz w:val="18"/>
               </w:rPr>
-              <w:t>12.12.2025</w:t>
+              <w:t>21.01.2026</w:t>
             </w:r>
           </w:p>
         </w:tc>
@@ -1638,7 +1638,7 @@
                 <w:color w:val="000000"/>
                 <w:sz w:val="18"/>
               </w:rPr>
-              <w:t>ППК25380</w:t>
+              <w:t>PP · QCCoA 001v02 (Cert. No. 020)</w:t>
             </w:r>
           </w:p>
         </w:tc>
@@ -1661,7 +1661,7 @@
                 <w:color w:val="000000"/>
                 <w:sz w:val="18"/>
               </w:rPr>
-              <w:t>12.12.2025</w:t>
+              <w:t>21.01.2026</w:t>
             </w:r>
           </w:p>
         </w:tc>

</xml_diff>